<commit_message>
ca7 opening-brief docx on the shared layout model: Times New Roman (was EB Garamond: DEF-FONT-002 failed), exact line boxes, typst's spaces and rows; page map by needles; folder gates XENG (fb-595.54.1)
docx: reference.docx from lib/docx/xengine-reference.sh (new note=/note_size= parameters; ca9's
reference still reproduced part for part) plus the CA styles in 20 pt boxes; xe.inlines on every run;
contents and authorities rows with the page column as right indent; no space above a heading that opens
a page; counsel columns and signature as typst's grid and pad.
pagemap.awk: a heading by label and title at the start of a line, citations as needles in document order
(the old search took unlinked mentions and a body sentence for a heading: 3 wrong TOC/TOA page numbers).
eval.yaml: params.cross_engine: gate. typst 8/8, latex 11/11, docx 11/11 (fb-595.54.1)
</commit_message>
<xml_diff>
--- a/courts/seventh-circuit/court-of-appeals/opening-brief/docx/reference.docx
+++ b/courts/seventh-circuit/court-of-appeals/opening-brief/docx/reference.docx
@@ -314,9 +314,9 @@
       </w:r>
     </w:p>
     <w:sectPr>
-      <w:footnotePr>
-        <w:numRestart w:val="eachSect"/>
-      </w:footnotePr>
+      <w:footerReference w:type="default" r:id="rIdFooter1"/>
+      <w:pgSz w:w="12240" w:h="15840"/>
+      <w:pgMar w:top="1440" w:right="1440" w:bottom="1440" w:left="1440" w:header="720" w:footer="432" w:gutter="0"/>
     </w:sectPr>
   </w:body>
 </w:document>
@@ -324,6 +324,31 @@
 
 <file path=word/comments.xml><?xml version="1.0" encoding="utf-8"?>
 <w:comments xmlns:w="http://schemas.openxmlformats.org/wordprocessingml/2006/main" xmlns:m="http://schemas.openxmlformats.org/officeDocument/2006/math" xmlns:r="http://schemas.openxmlformats.org/officeDocument/2006/relationships" xmlns:o="urn:schemas-microsoft-com:office:office" xmlns:v="urn:schemas-microsoft-com:vml" xmlns:w10="urn:schemas-microsoft-com:office:word" xmlns:a="http://schemas.openxmlformats.org/drawingml/2006/main" xmlns:pic="http://schemas.openxmlformats.org/drawingml/2006/picture" xmlns:wp="http://schemas.openxmlformats.org/drawingml/2006/wordprocessingDrawing"/>
+</file>
+
+<file path=word/footer1.xml><?xml version="1.0" encoding="utf-8"?>
+<w:ftr xmlns:w="http://schemas.openxmlformats.org/wordprocessingml/2006/main" xmlns:r="http://schemas.openxmlformats.org/officeDocument/2006/relationships">
+  <w:p>
+    <w:pPr>
+      <w:jc w:val="center"/>
+    </w:pPr>
+    <w:r>
+      <w:fldChar w:fldCharType="begin"/>
+    </w:r>
+    <w:r>
+      <w:instrText xml:space="preserve"> PAGE </w:instrText>
+    </w:r>
+    <w:r>
+      <w:fldChar w:fldCharType="separate"/>
+    </w:r>
+    <w:r>
+      <w:t>1</w:t>
+    </w:r>
+    <w:r>
+      <w:fldChar w:fldCharType="end"/>
+    </w:r>
+  </w:p>
+</w:ftr>
 </file>
 
 <file path=word/footnotes.xml><?xml version="1.0" encoding="utf-8"?>
@@ -485,20 +510,48 @@
   <w:docDefaults>
     <w:rPrDefault>
       <w:rPr>
-        <w:rFonts w:ascii="EB Garamond" w:hAnsi="EB Garamond" w:eastAsia="EB Garamond" w:cs="EB Garamond"/>
+        <w:rFonts w:ascii="Times New Roman" w:hAnsi="Times New Roman" w:eastAsia="Times New Roman" w:cs="Times New Roman"/>
         <w:sz w:val="28"/>
         <w:szCs w:val="28"/>
-        <w:lang w:val="en-US" w:eastAsia="en-US" w:bidi="ar-SA"/>
+        <w:lang w:val="en-US" w:eastAsia="zh-CN" w:bidi="ar-SA"/>
       </w:rPr>
     </w:rPrDefault>
     <w:pPrDefault>
       <w:pPr>
         <w:widowControl/>
-        <w:spacing w:after="0" w:line="240" w:lineRule="auto"/>
+        <w:spacing w:after="0"/>
       </w:pPr>
     </w:pPrDefault>
   </w:docDefaults>
   <w:latentStyles w:defLockedState="0" w:defUIPriority="0" w:defSemiHidden="0" w:defUnhideWhenUsed="0" w:defQFormat="0" w:count="276"/>
+  <w:style w:type="paragraph" w:default="1" w:styleId="Normal">
+    <w:name w:val="Normal"/>
+    <w:qFormat/>
+  </w:style>
+  <w:style w:type="paragraph" w:styleId="BodyText">
+    <w:name w:val="Body Text"/>
+    <w:basedOn w:val="Normal"/>
+    <w:link w:val="BodyTextChar"/>
+    <w:qFormat/>
+    <w:pPr>
+      <w:spacing w:before="0" w:after="0" w:line="628" w:lineRule="exact"/>
+      <w:ind w:firstLine="720"/>
+    </w:pPr>
+  </w:style>
+  <w:style w:type="paragraph" w:customStyle="1" w:styleId="FirstParagraph">
+    <w:name w:val="First Paragraph"/>
+    <w:basedOn w:val="BodyText"/>
+    <w:next w:val="BodyText"/>
+    <w:qFormat/>
+  </w:style>
+  <w:style w:type="paragraph" w:customStyle="1" w:styleId="Compact">
+    <w:name w:val="Compact"/>
+    <w:basedOn w:val="BodyText"/>
+    <w:qFormat/>
+    <w:pPr>
+      <w:spacing w:before="36" w:after="36"/>
+    </w:pPr>
+  </w:style>
   <w:style w:type="paragraph" w:styleId="Title">
     <w:name w:val="Title"/>
     <w:basedOn w:val="Normal"/>
@@ -631,6 +684,138 @@
     <w:qFormat/>
     <w:pPr/>
     <w:rPr/>
+  </w:style>
+  <w:style w:type="paragraph" w:styleId="Heading1">
+    <w:name w:val="heading 1"/>
+    <w:basedOn w:val="Normal"/>
+    <w:next w:val="BodyText"/>
+    <w:link w:val="Heading1Char"/>
+    <w:uiPriority w:val="9"/>
+    <w:qFormat/>
+    <w:rsid w:val="00A10FD9"/>
+    <w:pPr>
+      <w:keepNext/>
+      <w:keepLines/>
+      <w:spacing w:before="240" w:after="120" w:line="400" w:lineRule="exact"/>
+      <w:ind w:firstLine="0"/>
+      <w:jc w:val="center"/>
+      <w:outlineLvl w:val="0"/>
+    </w:pPr>
+    <w:rPr>
+      <w:rFonts w:ascii="Times New Roman" w:hAnsi="Times New Roman" w:eastAsia="Times New Roman" w:cs="Times New Roman"/>
+      <w:b/>
+      <w:bCs/>
+      <w:caps/>
+      <w:color w:val="000000"/>
+      <w:sz w:val="28"/>
+      <w:szCs w:val="28"/>
+    </w:rPr>
+  </w:style>
+  <w:style w:type="paragraph" w:styleId="Heading2">
+    <w:name w:val="heading 2"/>
+    <w:basedOn w:val="Normal"/>
+    <w:next w:val="BodyText"/>
+    <w:link w:val="Heading2Char"/>
+    <w:uiPriority w:val="9"/>
+    <w:semiHidden/>
+    <w:unhideWhenUsed/>
+    <w:qFormat/>
+    <w:rsid w:val="00A10FD9"/>
+    <w:pPr>
+      <w:keepNext/>
+      <w:keepLines/>
+      <w:spacing w:before="240" w:after="120" w:line="400" w:lineRule="exact"/>
+      <w:ind w:firstLine="0"/>
+      <w:outlineLvl w:val="1"/>
+    </w:pPr>
+    <w:rPr>
+      <w:rFonts w:ascii="Times New Roman" w:hAnsi="Times New Roman" w:eastAsia="Times New Roman" w:cs="Times New Roman"/>
+      <w:b/>
+      <w:bCs/>
+      <w:color w:val="000000"/>
+      <w:sz w:val="28"/>
+      <w:szCs w:val="28"/>
+    </w:rPr>
+  </w:style>
+  <w:style w:type="paragraph" w:styleId="Heading3">
+    <w:name w:val="heading 3"/>
+    <w:basedOn w:val="Normal"/>
+    <w:next w:val="BodyText"/>
+    <w:link w:val="Heading3Char"/>
+    <w:uiPriority w:val="9"/>
+    <w:semiHidden/>
+    <w:unhideWhenUsed/>
+    <w:qFormat/>
+    <w:rsid w:val="00A10FD9"/>
+    <w:pPr>
+      <w:keepNext/>
+      <w:keepLines/>
+      <w:spacing w:before="240" w:after="120" w:line="400" w:lineRule="exact"/>
+      <w:ind w:firstLine="0"/>
+      <w:outlineLvl w:val="2"/>
+    </w:pPr>
+    <w:rPr>
+      <w:rFonts w:ascii="Times New Roman" w:hAnsi="Times New Roman" w:eastAsia="Times New Roman" w:cs="Times New Roman"/>
+      <w:b/>
+      <w:bCs/>
+      <w:color w:val="000000"/>
+      <w:sz w:val="28"/>
+      <w:szCs w:val="28"/>
+    </w:rPr>
+  </w:style>
+  <w:style w:type="paragraph" w:styleId="Heading4">
+    <w:name w:val="heading 4"/>
+    <w:basedOn w:val="Normal"/>
+    <w:next w:val="BodyText"/>
+    <w:link w:val="Heading4Char"/>
+    <w:uiPriority w:val="9"/>
+    <w:semiHidden/>
+    <w:unhideWhenUsed/>
+    <w:qFormat/>
+    <w:rsid w:val="00A10FD9"/>
+    <w:pPr>
+      <w:keepNext/>
+      <w:keepLines/>
+      <w:spacing w:before="240" w:after="120" w:line="400" w:lineRule="exact"/>
+      <w:ind w:firstLine="0"/>
+      <w:outlineLvl w:val="3"/>
+    </w:pPr>
+    <w:rPr>
+      <w:rFonts w:ascii="Times New Roman" w:hAnsi="Times New Roman" w:eastAsia="Times New Roman" w:cs="Times New Roman"/>
+      <w:b/>
+      <w:bCs/>
+      <w:i/>
+      <w:color w:val="000000"/>
+      <w:sz w:val="28"/>
+      <w:szCs w:val="28"/>
+    </w:rPr>
+  </w:style>
+  <w:style w:type="paragraph" w:styleId="Heading5">
+    <w:name w:val="heading 5"/>
+    <w:basedOn w:val="Normal"/>
+    <w:next w:val="BodyText"/>
+    <w:link w:val="Heading5Char"/>
+    <w:uiPriority w:val="9"/>
+    <w:semiHidden/>
+    <w:unhideWhenUsed/>
+    <w:qFormat/>
+    <w:rsid w:val="00A10FD9"/>
+    <w:pPr>
+      <w:keepNext/>
+      <w:keepLines/>
+      <w:spacing w:before="240" w:after="120" w:line="400" w:lineRule="exact"/>
+      <w:ind w:firstLine="0"/>
+      <w:outlineLvl w:val="4"/>
+    </w:pPr>
+    <w:rPr>
+      <w:rFonts w:ascii="Times New Roman" w:hAnsi="Times New Roman" w:eastAsia="Times New Roman" w:cs="Times New Roman"/>
+      <w:b/>
+      <w:bCs/>
+      <w:i/>
+      <w:color w:val="000000"/>
+      <w:sz w:val="28"/>
+      <w:szCs w:val="28"/>
+    </w:rPr>
   </w:style>
   <w:style w:type="paragraph" w:styleId="Heading6">
     <w:name w:val="heading 6"/>
@@ -839,6 +1024,43 @@
       <w:color w:val="272727" w:themeColor="text1" w:themeTint="D8"/>
     </w:rPr>
   </w:style>
+  <w:style w:type="paragraph" w:customStyle="1" w:styleId="ListItem">
+    <w:name w:val="List Item"/>
+    <w:basedOn w:val="BodyText"/>
+    <w:qFormat/>
+    <w:pPr>
+      <w:spacing w:before="0" w:after="0" w:line="628" w:lineRule="exact"/>
+      <w:ind w:left="720" w:hanging="720"/>
+    </w:pPr>
+  </w:style>
+  <w:style w:type="paragraph" w:styleId="BlockText">
+    <w:name w:val="Block Text"/>
+    <w:basedOn w:val="BodyText"/>
+    <w:next w:val="BodyText"/>
+    <w:uiPriority w:val="9"/>
+    <w:unhideWhenUsed/>
+    <w:qFormat/>
+    <w:pPr>
+      <w:spacing w:before="280" w:after="280" w:line="400" w:lineRule="exact"/>
+      <w:ind w:firstLine="0" w:left="720" w:right="720"/>
+    </w:pPr>
+  </w:style>
+  <w:style w:type="paragraph" w:styleId="FootnoteText">
+    <w:name w:val="Footnote Text"/>
+    <w:basedOn w:val="Normal"/>
+    <w:next w:val="FootnoteText"/>
+    <w:uiPriority w:val="9"/>
+    <w:unhideWhenUsed/>
+    <w:qFormat/>
+    <w:pPr>
+      <w:keepLines/>
+      <w:spacing w:before="0" w:after="140" w:line="340" w:lineRule="exact"/>
+    </w:pPr>
+    <w:rPr>
+      <w:sz w:val="24"/>
+      <w:szCs w:val="24"/>
+    </w:rPr>
+  </w:style>
   <w:style w:type="paragraph" w:styleId="FootnoteBlockText">
     <w:name w:val="Footnote Block Text"/>
     <w:basedOn w:val="FootnoteText"/>
@@ -847,8 +1069,8 @@
     <w:unhideWhenUsed/>
     <w:qFormat/>
     <w:pPr>
-      <w:spacing w:before="100" w:after="100"/>
-      <w:ind w:firstLine="0" w:left="480" w:right="480"/>
+      <w:spacing w:before="280" w:after="280"/>
+      <w:ind w:firstLine="0" w:left="720" w:right="720"/>
     </w:pPr>
   </w:style>
   <w:style w:type="character" w:default="1" w:styleId="DefaultParagraphFont">
@@ -956,7 +1178,7 @@
     <w:name w:val="Hyperlink"/>
     <w:basedOn w:val="BodyTextChar"/>
     <w:rPr>
-      <w:color w:val="4F81BD" w:themeColor="accent1"/>
+      <w:color w:val="000000"/>
     </w:rPr>
   </w:style>
   <w:style w:type="paragraph" w:styleId="TOCHeading">
@@ -977,35 +1199,6 @@
       <w:color w:val="365F91" w:themeColor="accent1" w:themeShade="BF"/>
     </w:rPr>
   </w:style>
-  <w:style w:type="paragraph" w:styleId="Normal">
-    <w:name w:val="Normal"/>
-    <w:qFormat/>
-    <w:pPr>
-      <w:widowControl/>
-      <w:spacing w:before="0" w:after="0" w:line="240" w:lineRule="auto"/>
-      <w:ind w:firstLine="0"/>
-    </w:pPr>
-    <w:rPr/>
-  </w:style>
-  <w:style w:type="paragraph" w:styleId="BodyText">
-    <w:name w:val="Body Text"/>
-    <w:basedOn w:val="Normal"/>
-    <w:qFormat/>
-    <w:pPr>
-      <w:widowControl/>
-      <w:spacing w:before="0" w:after="0" w:line="629" w:lineRule="exact"/>
-      <w:ind w:firstLine="720"/>
-      <w:jc w:val="left"/>
-    </w:pPr>
-    <w:rPr/>
-  </w:style>
-  <w:style w:type="paragraph" w:styleId="FirstParagraph">
-    <w:name w:val="First Paragraph"/>
-    <w:basedOn w:val="BodyText"/>
-    <w:qFormat/>
-    <w:pPr/>
-    <w:rPr/>
-  </w:style>
   <w:style w:type="paragraph" w:customStyle="1" w:styleId="CABodyLast">
     <w:name w:val="CA Body Last"/>
     <w:basedOn w:val="BodyText"/>
@@ -1015,47 +1208,14 @@
     </w:pPr>
     <w:rPr/>
   </w:style>
-  <w:style w:type="paragraph" w:styleId="Compact">
-    <w:name w:val="Compact"/>
-    <w:basedOn w:val="Normal"/>
-    <w:qFormat/>
-    <w:pPr>
-      <w:spacing w:before="0" w:after="0" w:line="240" w:lineRule="auto"/>
-      <w:ind w:firstLine="0"/>
-    </w:pPr>
-    <w:rPr/>
-  </w:style>
-  <w:style w:type="paragraph" w:styleId="BlockText">
-    <w:name w:val="Block Text"/>
-    <w:basedOn w:val="Normal"/>
-    <w:qFormat/>
-    <w:pPr>
-      <w:spacing w:before="240" w:after="240" w:line="240" w:lineRule="auto"/>
-      <w:ind w:left="720" w:right="720" w:firstLine="0"/>
-    </w:pPr>
-    <w:rPr/>
-  </w:style>
-  <w:style w:type="paragraph" w:styleId="FootnoteText">
-    <w:name w:val="footnote text"/>
-    <w:basedOn w:val="Normal"/>
-    <w:qFormat/>
-    <w:pPr>
-      <w:spacing w:before="0" w:after="120" w:line="240" w:lineRule="auto"/>
-      <w:ind w:firstLine="0"/>
-    </w:pPr>
-    <w:rPr>
-      <w:sz w:val="24"/>
-      <w:szCs w:val="24"/>
-    </w:rPr>
-  </w:style>
-  <w:style w:type="paragraph" w:styleId="Heading1">
-    <w:name w:val="heading 1"/>
-    <w:basedOn w:val="Normal"/>
-    <w:qFormat/>
-    <w:pPr>
-      <w:keepNext/>
-      <w:keepLines/>
-      <w:spacing w:before="300" w:after="200" w:line="240" w:lineRule="auto"/>
+  <w:style w:type="paragraph" w:customStyle="1" w:styleId="CASection">
+    <w:name w:val="CA Section"/>
+    <w:basedOn w:val="Normal"/>
+    <w:qFormat/>
+    <w:pPr>
+      <w:keepNext/>
+      <w:keepLines/>
+      <w:spacing w:before="420" w:after="308" w:line="400" w:lineRule="exact"/>
       <w:ind w:firstLine="0"/>
       <w:jc w:val="center"/>
       <w:outlineLvl w:val="0"/>
@@ -1065,83 +1225,6 @@
       <w:caps/>
     </w:rPr>
   </w:style>
-  <w:style w:type="paragraph" w:styleId="Heading2">
-    <w:name w:val="heading 2"/>
-    <w:basedOn w:val="Normal"/>
-    <w:qFormat/>
-    <w:pPr>
-      <w:keepNext/>
-      <w:keepLines/>
-      <w:spacing w:before="240" w:after="200" w:line="240" w:lineRule="auto"/>
-      <w:ind w:firstLine="0"/>
-      <w:outlineLvl w:val="1"/>
-    </w:pPr>
-    <w:rPr>
-      <w:b/>
-    </w:rPr>
-  </w:style>
-  <w:style w:type="paragraph" w:styleId="Heading3">
-    <w:name w:val="heading 3"/>
-    <w:basedOn w:val="Normal"/>
-    <w:qFormat/>
-    <w:pPr>
-      <w:keepNext/>
-      <w:keepLines/>
-      <w:spacing w:before="240" w:after="200" w:line="240" w:lineRule="auto"/>
-      <w:ind w:firstLine="0"/>
-      <w:outlineLvl w:val="2"/>
-    </w:pPr>
-    <w:rPr>
-      <w:b/>
-    </w:rPr>
-  </w:style>
-  <w:style w:type="paragraph" w:styleId="Heading4">
-    <w:name w:val="heading 4"/>
-    <w:basedOn w:val="Normal"/>
-    <w:qFormat/>
-    <w:pPr>
-      <w:keepNext/>
-      <w:keepLines/>
-      <w:spacing w:before="240" w:after="200" w:line="240" w:lineRule="auto"/>
-      <w:ind w:firstLine="0"/>
-      <w:outlineLvl w:val="3"/>
-    </w:pPr>
-    <w:rPr>
-      <w:b/>
-    </w:rPr>
-  </w:style>
-  <w:style w:type="paragraph" w:styleId="Heading5">
-    <w:name w:val="heading 5"/>
-    <w:basedOn w:val="Normal"/>
-    <w:qFormat/>
-    <w:pPr>
-      <w:keepNext/>
-      <w:keepLines/>
-      <w:spacing w:before="240" w:after="200" w:line="240" w:lineRule="auto"/>
-      <w:ind w:firstLine="0"/>
-      <w:outlineLvl w:val="4"/>
-    </w:pPr>
-    <w:rPr>
-      <w:b/>
-    </w:rPr>
-  </w:style>
-  <w:style w:type="paragraph" w:customStyle="1" w:styleId="CASection">
-    <w:name w:val="CA Section"/>
-    <w:basedOn w:val="Normal"/>
-    <w:qFormat/>
-    <w:pPr>
-      <w:keepNext/>
-      <w:keepLines/>
-      <w:spacing w:before="300" w:after="200" w:line="240" w:lineRule="auto"/>
-      <w:ind w:firstLine="0"/>
-      <w:jc w:val="center"/>
-      <w:outlineLvl w:val="0"/>
-    </w:pPr>
-    <w:rPr>
-      <w:b/>
-      <w:caps/>
-    </w:rPr>
-  </w:style>
   <w:style w:type="paragraph" w:customStyle="1" w:styleId="CAPoint">
     <w:name w:val="CA Point"/>
     <w:basedOn w:val="Normal"/>
@@ -1149,14 +1232,13 @@
     <w:pPr>
       <w:keepNext/>
       <w:keepLines/>
-      <w:spacing w:before="240" w:after="200" w:line="240" w:lineRule="auto"/>
+      <w:spacing w:before="336" w:after="280" w:line="400" w:lineRule="exact"/>
       <w:ind w:firstLine="0"/>
       <w:jc w:val="center"/>
       <w:outlineLvl w:val="1"/>
     </w:pPr>
     <w:rPr>
       <w:b/>
-      <w:smallCaps/>
     </w:rPr>
   </w:style>
   <w:style w:type="paragraph" w:customStyle="1" w:styleId="CAHeadL2S0">
@@ -1169,7 +1251,7 @@
       <w:tabs>
         <w:tab w:val="left" w:pos="720"/>
       </w:tabs>
-      <w:spacing w:before="240" w:after="200" w:line="240" w:lineRule="auto"/>
+      <w:spacing w:before="308" w:after="252" w:line="400" w:lineRule="exact"/>
       <w:ind w:left="720" w:hanging="720"/>
       <w:jc w:val="left"/>
       <w:outlineLvl w:val="1"/>
@@ -1188,7 +1270,7 @@
       <w:tabs>
         <w:tab w:val="left" w:pos="1440"/>
       </w:tabs>
-      <w:spacing w:before="240" w:after="200" w:line="240" w:lineRule="auto"/>
+      <w:spacing w:before="308" w:after="252" w:line="400" w:lineRule="exact"/>
       <w:ind w:left="1440" w:hanging="720"/>
       <w:jc w:val="left"/>
       <w:outlineLvl w:val="1"/>
@@ -1207,7 +1289,7 @@
       <w:tabs>
         <w:tab w:val="left" w:pos="2160"/>
       </w:tabs>
-      <w:spacing w:before="240" w:after="200" w:line="240" w:lineRule="auto"/>
+      <w:spacing w:before="308" w:after="252" w:line="400" w:lineRule="exact"/>
       <w:ind w:left="2160" w:hanging="720"/>
       <w:jc w:val="left"/>
       <w:outlineLvl w:val="1"/>
@@ -1226,7 +1308,7 @@
       <w:tabs>
         <w:tab w:val="left" w:pos="2880"/>
       </w:tabs>
-      <w:spacing w:before="240" w:after="200" w:line="240" w:lineRule="auto"/>
+      <w:spacing w:before="308" w:after="252" w:line="400" w:lineRule="exact"/>
       <w:ind w:left="2880" w:hanging="720"/>
       <w:jc w:val="left"/>
       <w:outlineLvl w:val="1"/>
@@ -1245,7 +1327,7 @@
       <w:tabs>
         <w:tab w:val="left" w:pos="3600"/>
       </w:tabs>
-      <w:spacing w:before="240" w:after="200" w:line="240" w:lineRule="auto"/>
+      <w:spacing w:before="308" w:after="252" w:line="400" w:lineRule="exact"/>
       <w:ind w:left="3600" w:hanging="720"/>
       <w:jc w:val="left"/>
       <w:outlineLvl w:val="1"/>
@@ -1264,7 +1346,7 @@
       <w:tabs>
         <w:tab w:val="left" w:pos="720"/>
       </w:tabs>
-      <w:spacing w:before="240" w:after="200" w:line="240" w:lineRule="auto"/>
+      <w:spacing w:before="308" w:after="252" w:line="400" w:lineRule="exact"/>
       <w:ind w:left="720" w:hanging="720"/>
       <w:jc w:val="left"/>
       <w:outlineLvl w:val="2"/>
@@ -1283,7 +1365,7 @@
       <w:tabs>
         <w:tab w:val="left" w:pos="1440"/>
       </w:tabs>
-      <w:spacing w:before="240" w:after="200" w:line="240" w:lineRule="auto"/>
+      <w:spacing w:before="308" w:after="252" w:line="400" w:lineRule="exact"/>
       <w:ind w:left="1440" w:hanging="720"/>
       <w:jc w:val="left"/>
       <w:outlineLvl w:val="2"/>
@@ -1302,7 +1384,7 @@
       <w:tabs>
         <w:tab w:val="left" w:pos="2160"/>
       </w:tabs>
-      <w:spacing w:before="240" w:after="200" w:line="240" w:lineRule="auto"/>
+      <w:spacing w:before="308" w:after="252" w:line="400" w:lineRule="exact"/>
       <w:ind w:left="2160" w:hanging="720"/>
       <w:jc w:val="left"/>
       <w:outlineLvl w:val="2"/>
@@ -1321,7 +1403,7 @@
       <w:tabs>
         <w:tab w:val="left" w:pos="2880"/>
       </w:tabs>
-      <w:spacing w:before="240" w:after="200" w:line="240" w:lineRule="auto"/>
+      <w:spacing w:before="308" w:after="252" w:line="400" w:lineRule="exact"/>
       <w:ind w:left="2880" w:hanging="720"/>
       <w:jc w:val="left"/>
       <w:outlineLvl w:val="2"/>
@@ -1340,7 +1422,7 @@
       <w:tabs>
         <w:tab w:val="left" w:pos="3600"/>
       </w:tabs>
-      <w:spacing w:before="240" w:after="200" w:line="240" w:lineRule="auto"/>
+      <w:spacing w:before="308" w:after="252" w:line="400" w:lineRule="exact"/>
       <w:ind w:left="3600" w:hanging="720"/>
       <w:jc w:val="left"/>
       <w:outlineLvl w:val="2"/>
@@ -1359,7 +1441,7 @@
       <w:tabs>
         <w:tab w:val="left" w:pos="720"/>
       </w:tabs>
-      <w:spacing w:before="240" w:after="200" w:line="240" w:lineRule="auto"/>
+      <w:spacing w:before="308" w:after="252" w:line="400" w:lineRule="exact"/>
       <w:ind w:left="720" w:hanging="720"/>
       <w:jc w:val="left"/>
       <w:outlineLvl w:val="3"/>
@@ -1378,7 +1460,7 @@
       <w:tabs>
         <w:tab w:val="left" w:pos="1440"/>
       </w:tabs>
-      <w:spacing w:before="240" w:after="200" w:line="240" w:lineRule="auto"/>
+      <w:spacing w:before="308" w:after="252" w:line="400" w:lineRule="exact"/>
       <w:ind w:left="1440" w:hanging="720"/>
       <w:jc w:val="left"/>
       <w:outlineLvl w:val="3"/>
@@ -1397,7 +1479,7 @@
       <w:tabs>
         <w:tab w:val="left" w:pos="2160"/>
       </w:tabs>
-      <w:spacing w:before="240" w:after="200" w:line="240" w:lineRule="auto"/>
+      <w:spacing w:before="308" w:after="252" w:line="400" w:lineRule="exact"/>
       <w:ind w:left="2160" w:hanging="720"/>
       <w:jc w:val="left"/>
       <w:outlineLvl w:val="3"/>
@@ -1416,7 +1498,7 @@
       <w:tabs>
         <w:tab w:val="left" w:pos="2880"/>
       </w:tabs>
-      <w:spacing w:before="240" w:after="200" w:line="240" w:lineRule="auto"/>
+      <w:spacing w:before="308" w:after="252" w:line="400" w:lineRule="exact"/>
       <w:ind w:left="2880" w:hanging="720"/>
       <w:jc w:val="left"/>
       <w:outlineLvl w:val="3"/>
@@ -1435,7 +1517,7 @@
       <w:tabs>
         <w:tab w:val="left" w:pos="3600"/>
       </w:tabs>
-      <w:spacing w:before="240" w:after="200" w:line="240" w:lineRule="auto"/>
+      <w:spacing w:before="308" w:after="252" w:line="400" w:lineRule="exact"/>
       <w:ind w:left="3600" w:hanging="720"/>
       <w:jc w:val="left"/>
       <w:outlineLvl w:val="3"/>
@@ -1454,7 +1536,7 @@
       <w:tabs>
         <w:tab w:val="left" w:pos="720"/>
       </w:tabs>
-      <w:spacing w:before="240" w:after="200" w:line="240" w:lineRule="auto"/>
+      <w:spacing w:before="308" w:after="252" w:line="400" w:lineRule="exact"/>
       <w:ind w:left="720" w:hanging="720"/>
       <w:jc w:val="left"/>
       <w:outlineLvl w:val="4"/>
@@ -1474,7 +1556,7 @@
       <w:tabs>
         <w:tab w:val="left" w:pos="1440"/>
       </w:tabs>
-      <w:spacing w:before="240" w:after="200" w:line="240" w:lineRule="auto"/>
+      <w:spacing w:before="308" w:after="252" w:line="400" w:lineRule="exact"/>
       <w:ind w:left="1440" w:hanging="720"/>
       <w:jc w:val="left"/>
       <w:outlineLvl w:val="4"/>
@@ -1494,7 +1576,7 @@
       <w:tabs>
         <w:tab w:val="left" w:pos="2160"/>
       </w:tabs>
-      <w:spacing w:before="240" w:after="200" w:line="240" w:lineRule="auto"/>
+      <w:spacing w:before="308" w:after="252" w:line="400" w:lineRule="exact"/>
       <w:ind w:left="2160" w:hanging="720"/>
       <w:jc w:val="left"/>
       <w:outlineLvl w:val="4"/>
@@ -1514,7 +1596,7 @@
       <w:tabs>
         <w:tab w:val="left" w:pos="2880"/>
       </w:tabs>
-      <w:spacing w:before="240" w:after="200" w:line="240" w:lineRule="auto"/>
+      <w:spacing w:before="308" w:after="252" w:line="400" w:lineRule="exact"/>
       <w:ind w:left="2880" w:hanging="720"/>
       <w:jc w:val="left"/>
       <w:outlineLvl w:val="4"/>
@@ -1534,7 +1616,7 @@
       <w:tabs>
         <w:tab w:val="left" w:pos="3600"/>
       </w:tabs>
-      <w:spacing w:before="240" w:after="200" w:line="240" w:lineRule="auto"/>
+      <w:spacing w:before="308" w:after="252" w:line="400" w:lineRule="exact"/>
       <w:ind w:left="3600" w:hanging="720"/>
       <w:jc w:val="left"/>
       <w:outlineLvl w:val="4"/>
@@ -1549,7 +1631,7 @@
     <w:basedOn w:val="Normal"/>
     <w:qFormat/>
     <w:pPr>
-      <w:spacing w:before="0" w:after="0" w:line="240" w:lineRule="auto"/>
+      <w:spacing w:before="0" w:after="0" w:line="400" w:lineRule="exact"/>
       <w:ind w:firstLine="0"/>
       <w:jc w:val="center"/>
     </w:pPr>
@@ -1561,7 +1643,7 @@
     <w:qFormat/>
     <w:pPr>
       <w:keepNext/>
-      <w:spacing w:before="60" w:after="60" w:line="240" w:lineRule="auto"/>
+      <w:spacing w:before="60" w:after="60" w:line="400" w:lineRule="exact"/>
     </w:pPr>
     <w:rPr>
       <w:b/>
@@ -1572,7 +1654,7 @@
     <w:basedOn w:val="Normal"/>
     <w:qFormat/>
     <w:pPr>
-      <w:spacing w:before="0" w:after="80" w:line="240" w:lineRule="auto"/>
+      <w:spacing w:before="0" w:after="0" w:line="140" w:lineRule="exact"/>
     </w:pPr>
     <w:rPr/>
   </w:style>
@@ -1585,7 +1667,7 @@
       <w:pBdr>
         <w:bottom w:val="single" w:sz="6" w:space="1" w:color="000000"/>
       </w:pBdr>
-      <w:spacing w:before="0" w:after="100" w:line="240" w:lineRule="auto"/>
+      <w:spacing w:before="0" w:after="100" w:line="120" w:lineRule="exact"/>
       <w:ind w:left="3240" w:right="3240" w:firstLine="0"/>
       <w:jc w:val="center"/>
     </w:pPr>
@@ -1600,7 +1682,7 @@
       <w:pBdr>
         <w:top w:val="double" w:sz="6" w:space="1" w:color="000000"/>
       </w:pBdr>
-      <w:spacing w:before="0" w:after="240" w:line="240" w:lineRule="auto"/>
+      <w:spacing w:before="0" w:after="120" w:line="120" w:lineRule="exact"/>
       <w:ind w:firstLine="0"/>
     </w:pPr>
     <w:rPr/>
@@ -1611,7 +1693,7 @@
     <w:qFormat/>
     <w:pPr>
       <w:keepLines/>
-      <w:spacing w:before="0" w:after="0" w:line="240" w:lineRule="auto"/>
+      <w:spacing w:before="0" w:after="0" w:line="400" w:lineRule="exact"/>
       <w:ind w:left="4680" w:firstLine="0"/>
       <w:jc w:val="left"/>
     </w:pPr>
@@ -1622,7 +1704,7 @@
     <w:basedOn w:val="Normal"/>
     <w:qFormat/>
     <w:pPr>
-      <w:spacing w:before="0" w:after="0" w:line="240" w:lineRule="auto"/>
+      <w:spacing w:before="0" w:after="0" w:line="400" w:lineRule="exact"/>
       <w:ind w:firstLine="0"/>
       <w:jc w:val="left"/>
     </w:pPr>
@@ -1635,7 +1717,7 @@
     <w:pPr>
       <w:keepNext/>
       <w:keepLines/>
-      <w:spacing w:before="0" w:after="0" w:line="240" w:lineRule="auto"/>
+      <w:spacing w:before="0" w:after="0" w:line="400" w:lineRule="exact"/>
       <w:ind w:left="4680" w:firstLine="0"/>
       <w:jc w:val="left"/>
     </w:pPr>
@@ -1646,7 +1728,7 @@
     <w:basedOn w:val="CASignature"/>
     <w:qFormat/>
     <w:pPr>
-      <w:spacing w:before="360" w:after="0" w:line="240" w:lineRule="auto"/>
+      <w:spacing w:before="392" w:after="0" w:line="400" w:lineRule="exact"/>
     </w:pPr>
     <w:rPr/>
   </w:style>
@@ -1655,7 +1737,7 @@
     <w:basedOn w:val="Normal"/>
     <w:qFormat/>
     <w:pPr>
-      <w:spacing w:before="0" w:after="240" w:line="240" w:lineRule="auto"/>
+      <w:spacing w:before="280" w:after="280" w:line="400" w:lineRule="exact"/>
       <w:ind w:firstLine="0"/>
       <w:jc w:val="left"/>
     </w:pPr>
@@ -1666,12 +1748,12 @@
     <w:basedOn w:val="Normal"/>
     <w:qFormat/>
     <w:pPr>
-      <w:keepNext/>
+      <w:keepLines/>
       <w:tabs>
         <w:tab w:val="right" w:leader="dot" w:pos="9360"/>
       </w:tabs>
-      <w:spacing w:before="240" w:after="0" w:line="240" w:lineRule="auto"/>
-      <w:ind w:firstLine="0"/>
+      <w:spacing w:before="168" w:after="0" w:line="400" w:lineRule="exact"/>
+      <w:ind w:left="720" w:right="720" w:hanging="720"/>
     </w:pPr>
     <w:rPr/>
   </w:style>
@@ -1685,8 +1767,8 @@
         <w:tab w:val="left" w:leader="none" w:pos="720"/>
         <w:tab w:val="right" w:leader="dot" w:pos="9360"/>
       </w:tabs>
-      <w:spacing w:before="120" w:after="0" w:line="240" w:lineRule="auto"/>
-      <w:ind w:left="720" w:hanging="720"/>
+      <w:spacing w:before="98" w:after="0" w:line="400" w:lineRule="exact"/>
+      <w:ind w:left="720" w:right="720" w:hanging="720"/>
     </w:pPr>
     <w:rPr/>
   </w:style>
@@ -1700,8 +1782,8 @@
         <w:tab w:val="left" w:leader="none" w:pos="1440"/>
         <w:tab w:val="right" w:leader="dot" w:pos="9360"/>
       </w:tabs>
-      <w:spacing w:before="120" w:after="0" w:line="240" w:lineRule="auto"/>
-      <w:ind w:left="1440" w:hanging="720"/>
+      <w:spacing w:before="98" w:after="0" w:line="400" w:lineRule="exact"/>
+      <w:ind w:left="1440" w:right="720" w:hanging="720"/>
     </w:pPr>
     <w:rPr/>
   </w:style>
@@ -1715,8 +1797,8 @@
         <w:tab w:val="left" w:leader="none" w:pos="2160"/>
         <w:tab w:val="right" w:leader="dot" w:pos="9360"/>
       </w:tabs>
-      <w:spacing w:before="120" w:after="0" w:line="240" w:lineRule="auto"/>
-      <w:ind w:left="2160" w:hanging="720"/>
+      <w:spacing w:before="98" w:after="0" w:line="400" w:lineRule="exact"/>
+      <w:ind w:left="2160" w:right="720" w:hanging="720"/>
     </w:pPr>
     <w:rPr/>
   </w:style>
@@ -1730,8 +1812,8 @@
         <w:tab w:val="left" w:leader="none" w:pos="2880"/>
         <w:tab w:val="right" w:leader="dot" w:pos="9360"/>
       </w:tabs>
-      <w:spacing w:before="120" w:after="0" w:line="240" w:lineRule="auto"/>
-      <w:ind w:left="2880" w:hanging="720"/>
+      <w:spacing w:before="98" w:after="0" w:line="400" w:lineRule="exact"/>
+      <w:ind w:left="2880" w:right="720" w:hanging="720"/>
     </w:pPr>
     <w:rPr/>
   </w:style>
@@ -1745,10 +1827,25 @@
         <w:tab w:val="left" w:leader="none" w:pos="3600"/>
         <w:tab w:val="right" w:leader="dot" w:pos="9360"/>
       </w:tabs>
-      <w:spacing w:before="120" w:after="0" w:line="240" w:lineRule="auto"/>
-      <w:ind w:left="3600" w:hanging="720"/>
+      <w:spacing w:before="98" w:after="0" w:line="400" w:lineRule="exact"/>
+      <w:ind w:left="3600" w:right="720" w:hanging="720"/>
     </w:pPr>
     <w:rPr/>
+  </w:style>
+  <w:style w:type="paragraph" w:customStyle="1" w:styleId="CATocPage">
+    <w:name w:val="CA TOC Page"/>
+    <w:basedOn w:val="Normal"/>
+    <w:qFormat/>
+    <w:pPr>
+      <w:keepNext/>
+      <w:spacing w:before="84" w:after="0" w:line="400" w:lineRule="exact"/>
+      <w:ind w:firstLine="0"/>
+      <w:jc w:val="right"/>
+    </w:pPr>
+    <w:rPr>
+      <w:b/>
+      <w:u w:val="single"/>
+    </w:rPr>
   </w:style>
   <w:style w:type="paragraph" w:customStyle="1" w:styleId="CAToaGroup">
     <w:name w:val="CA TOA Group"/>
@@ -1759,7 +1856,7 @@
       <w:tabs>
         <w:tab w:val="right" w:pos="9360"/>
       </w:tabs>
-      <w:spacing w:before="160" w:after="60" w:line="240" w:lineRule="auto"/>
+      <w:spacing w:before="392" w:after="56" w:line="400" w:lineRule="exact"/>
       <w:ind w:firstLine="0"/>
     </w:pPr>
     <w:rPr>
@@ -1775,8 +1872,8 @@
       <w:tabs>
         <w:tab w:val="right" w:leader="dot" w:pos="9360"/>
       </w:tabs>
-      <w:spacing w:before="60" w:after="0" w:line="240" w:lineRule="auto"/>
-      <w:ind w:left="504" w:right="720" w:hanging="504"/>
+      <w:spacing w:before="196" w:after="0" w:line="400" w:lineRule="exact"/>
+      <w:ind w:left="504" w:right="1120" w:hanging="504"/>
     </w:pPr>
     <w:rPr/>
   </w:style>

</xml_diff>